<commit_message>
docs(arquitectura): arquitectura v0.2 con una sola cuenta y ADR-001 a ADR-012
</commit_message>
<xml_diff>
--- a/entregables/Documento_de_requerimientos_Hindama_v1.0.docx
+++ b/entregables/Documento_de_requerimientos_Hindama_v1.0.docx
@@ -6358,7 +6358,7 @@
         <w:rPr>
           <w:color w:val="000000" w:themeColor="text1"/>
         </w:rPr>
-        <w:t xml:space="preserve">Trabajos en segundo plano: Redis con RQ.</w:t>
+        <w:t xml:space="preserve">Trabajos en segundo plano: cola asíncrona sobre Redis.</w:t>
       </w:r>
     </w:p>
     <w:p>
@@ -12491,7 +12491,7 @@
           <w:bCs/>
           <w:color w:val="000000" w:themeColor="text1"/>
         </w:rPr>
-        <w:t xml:space="preserve">Redis y RQ:</w:t>
+        <w:t xml:space="preserve">Redis y cola asíncrona:</w:t>
       </w:r>
       <w:r>
         <w:rPr>

</xml_diff>